<commit_message>
docs: add compatible screen video preview
</commit_message>
<xml_diff>
--- a/validation/loop3/three_algorithm_localization_report_20260828.docx
+++ b/validation/loop3/three_algorithm_localization_report_20260828.docx
@@ -1002,7 +1002,7 @@
     </w:p>
     <w:p>
       <w:r>
-        <w:t>现场录屏已经同时导出为 GIF 和 MP4。由于很多 Word 阅读器会把 GIF 只显示成首帧，所以这里保留 GIF 供外部查看，并额外放一张中间帧封面图与 MP4，方便在 Word 里直接播放或至少看到代表性画面；另外附上局部误匹配和整体路径的两张原始截图，便于和导师沟通具体拐角问题。</w:t>
+        <w:t>现场录屏已经同时导出为 GIF、MP4 和 HTML 预览页。由于很多 Word 阅读器会把 GIF 只显示成首帧，所以这里保留 GIF 供外部查看，并额外放一张中间帧封面图、MP4 和 HTML 预览页，方便在 Word 里直接打开外部查看；另外附上局部误匹配和整体路径的两张原始截图，便于和导师沟通具体拐角问题。</w:t>
       </w:r>
     </w:p>
     <w:p>
@@ -1060,7 +1060,7 @@
         <w:pStyle w:val="ListBullet"/>
       </w:pPr>
       <w:r>
-        <w:t>GIF：figures/screen_video_20260828_152939.gif</w:t>
+        <w:t>GIF：figures/screen_video_20260828_152939_loop_small.gif</w:t>
       </w:r>
     </w:p>
     <w:p>
@@ -1069,6 +1069,14 @@
       </w:pPr>
       <w:r>
         <w:t>MP4：figures/screen_video_20260828_152939.mp4</w:t>
+      </w:r>
+    </w:p>
+    <w:p>
+      <w:pPr>
+        <w:pStyle w:val="ListBullet"/>
+      </w:pPr>
+      <w:r>
+        <w:t>HTML 预览：figures/screen_video_preview_20260828.html</w:t>
       </w:r>
     </w:p>
     <w:p>

</xml_diff>